<commit_message>
aggiunto menu navigazione e pagina prenotazioni
</commit_message>
<xml_diff>
--- a/SUPABASE.docx
+++ b/SUPABASE.docx
@@ -9,19 +9,14 @@
     </w:p>
     <w:p>
       <w:r>
-        <w:t>Pwd: V1aC@</w:t>
-      </w:r>
-      <w:proofErr w:type="gramStart"/>
-      <w:r>
-        <w:t>mpr!An</w:t>
-      </w:r>
-      <w:proofErr w:type="gramEnd"/>
-      <w:r>
-        <w:t>@22</w:t>
+        <w:t>Pwd: V1aC@mpr!An@22</w:t>
       </w:r>
     </w:p>
     <w:p>
       <w:r>
+        <w:rPr>
+          <w:noProof/>
+        </w:rPr>
         <w:drawing>
           <wp:inline distT="0" distB="0" distL="0" distR="0" wp14:anchorId="3C477AC4" wp14:editId="0DBF3B72">
             <wp:extent cx="6120130" cy="4963160"/>
@@ -72,7 +67,7 @@
     </w:p>
     <w:p>
       <w:r>
-        <w:t>sb_secret_E2DHhyilZs0hD-WJwyDqvw_xYRowMpY</w:t>
+        <w:t>sb_secret_BrT2_08nM48sVhSn_QtDPA_o8A1LG1T</w:t>
       </w:r>
     </w:p>
     <w:p/>
@@ -91,6 +86,9 @@
     <w:p/>
     <w:p>
       <w:r>
+        <w:rPr>
+          <w:noProof/>
+        </w:rPr>
         <w:drawing>
           <wp:inline distT="0" distB="0" distL="0" distR="0" wp14:anchorId="49DAF269" wp14:editId="32FA2321">
             <wp:extent cx="6120130" cy="6352540"/>
@@ -146,15 +144,7 @@
     </w:p>
     <w:p>
       <w:r>
-        <w:t xml:space="preserve">Project </w:t>
-      </w:r>
-      <w:proofErr w:type="gramStart"/>
-      <w:r>
-        <w:t xml:space="preserve">URL:   </w:t>
-      </w:r>
-      <w:proofErr w:type="gramEnd"/>
-      <w:r>
-        <w:t xml:space="preserve">    https://iixmkjjwqifmbzayugsy.supabase.co</w:t>
+        <w:t>Project URL:       https://iixmkjjwqifmbzayugsy.supabase.co</w:t>
       </w:r>
     </w:p>
     <w:p>
@@ -178,15 +168,7 @@
         <w:t xml:space="preserve">DB Password: </w:t>
       </w:r>
       <w:r>
-        <w:t>V1aC@</w:t>
-      </w:r>
-      <w:proofErr w:type="gramStart"/>
-      <w:r>
-        <w:t>mpr!An</w:t>
-      </w:r>
-      <w:proofErr w:type="gramEnd"/>
-      <w:r>
-        <w:t>@22</w:t>
+        <w:t>V1aC@mpr!An@22</w:t>
       </w:r>
     </w:p>
     <w:p>
@@ -808,6 +790,7 @@
   <w:style w:type="character" w:default="1" w:styleId="Carpredefinitoparagrafo">
     <w:name w:val="Default Paragraph Font"/>
     <w:uiPriority w:val="1"/>
+    <w:semiHidden/>
     <w:unhideWhenUsed/>
   </w:style>
   <w:style w:type="table" w:default="1" w:styleId="Tabellanormale">

</xml_diff>